<commit_message>
Add cancel & reschedule analysis tasks to pre-demo review
Two new guided sections (cancel_load/confirm_cancellation with TONU, and
reschedule_load/confirm_reschedule with the 3-level reassignment ladder and
Detention/Layover) plus regenerated .docx.

Co-Authored-By: Claude Opus 4.8 <noreply@anthropic.com>
Claude-Session: https://claude.ai/code/session_01VCggZzP7tmGZFSrtDGttxm
</commit_message>
<xml_diff>
--- a/docs/REVISION_PRE_DEMO.docx
+++ b/docs/REVISION_PRE_DEMO.docx
@@ -2761,172 +2761,364 @@
         <w:spacing w:after="100" w:before="220"/>
       </w:pPr>
       <w:r>
-        <w:t xml:space="preserve">📋 Tracker consolidado (llénalo al final)</w:t>
-      </w:r>
-    </w:p>
-    <w:p/>
-    <w:p>
-      <w:pPr>
-        <w:spacing w:after="60"/>
-      </w:pPr>
-      <w:r>
-        <w:t xml:space="preserve">Después de revisar todo, junta aquí lo anotado, ordenado por severidad:</w:t>
-      </w:r>
-    </w:p>
-    <w:p/>
-    <w:p>
-      <w:pPr>
-        <w:pStyle w:val="Heading3"/>
-        <w:spacing w:after="80" w:before="180"/>
-      </w:pPr>
-      <w:r>
-        <w:t xml:space="preserve">🔴 Bloquea demo (arreglar ANTES de salir)</w:t>
-      </w:r>
-    </w:p>
-    <w:p>
-      <w:pPr>
-        <w:shd w:fill="F3F3F3" w:val="clear"/>
-        <w:spacing w:after="0"/>
-      </w:pPr>
-      <w:r>
-        <w:rPr>
-          <w:rFonts w:ascii="Consolas" w:cs="Consolas" w:eastAsia="Consolas" w:hAnsi="Consolas"/>
-          <w:sz w:val="18"/>
-          <w:szCs w:val="18"/>
-        </w:rPr>
-        <w:t xml:space="preserve">| # | Área | Qué pasó | Estado |</w:t>
-      </w:r>
-    </w:p>
-    <w:p>
-      <w:pPr>
-        <w:shd w:fill="F3F3F3" w:val="clear"/>
-        <w:spacing w:after="0"/>
-      </w:pPr>
-      <w:r>
-        <w:rPr>
-          <w:rFonts w:ascii="Consolas" w:cs="Consolas" w:eastAsia="Consolas" w:hAnsi="Consolas"/>
-          <w:sz w:val="18"/>
-          <w:szCs w:val="18"/>
-        </w:rPr>
-        <w:t xml:space="preserve">|---|------|----------|--------|</w:t>
-      </w:r>
-    </w:p>
-    <w:p>
-      <w:pPr>
-        <w:shd w:fill="F3F3F3" w:val="clear"/>
-        <w:spacing w:after="0"/>
-      </w:pPr>
-      <w:r>
-        <w:rPr>
-          <w:rFonts w:ascii="Consolas" w:cs="Consolas" w:eastAsia="Consolas" w:hAnsi="Consolas"/>
-          <w:sz w:val="18"/>
-          <w:szCs w:val="18"/>
-        </w:rPr>
-        <w:t xml:space="preserve">| 1 |      |          |        |</w:t>
-      </w:r>
-    </w:p>
-    <w:p/>
-    <w:p>
-      <w:pPr>
-        <w:pStyle w:val="Heading3"/>
-        <w:spacing w:after="80" w:before="180"/>
-      </w:pPr>
-      <w:r>
-        <w:t xml:space="preserve">🟡 Después (post-demo)</w:t>
-      </w:r>
-    </w:p>
-    <w:p>
-      <w:pPr>
-        <w:shd w:fill="F3F3F3" w:val="clear"/>
-        <w:spacing w:after="0"/>
-      </w:pPr>
-      <w:r>
-        <w:rPr>
-          <w:rFonts w:ascii="Consolas" w:cs="Consolas" w:eastAsia="Consolas" w:hAnsi="Consolas"/>
-          <w:sz w:val="18"/>
-          <w:szCs w:val="18"/>
-        </w:rPr>
-        <w:t xml:space="preserve">| # | Área | Qué pasó |</w:t>
-      </w:r>
-    </w:p>
-    <w:p>
-      <w:pPr>
-        <w:shd w:fill="F3F3F3" w:val="clear"/>
-        <w:spacing w:after="0"/>
-      </w:pPr>
-      <w:r>
-        <w:rPr>
-          <w:rFonts w:ascii="Consolas" w:cs="Consolas" w:eastAsia="Consolas" w:hAnsi="Consolas"/>
-          <w:sz w:val="18"/>
-          <w:szCs w:val="18"/>
-        </w:rPr>
-        <w:t xml:space="preserve">|---|------|----------|</w:t>
-      </w:r>
-    </w:p>
-    <w:p>
-      <w:pPr>
-        <w:shd w:fill="F3F3F3" w:val="clear"/>
-        <w:spacing w:after="0"/>
-      </w:pPr>
-      <w:r>
-        <w:rPr>
-          <w:rFonts w:ascii="Consolas" w:cs="Consolas" w:eastAsia="Consolas" w:hAnsi="Consolas"/>
-          <w:sz w:val="18"/>
-          <w:szCs w:val="18"/>
-        </w:rPr>
-        <w:t xml:space="preserve">| 1 |      |          |</w:t>
-      </w:r>
-    </w:p>
-    <w:p/>
-    <w:p>
-      <w:pPr>
-        <w:pStyle w:val="Heading3"/>
-        <w:spacing w:after="80" w:before="180"/>
-      </w:pPr>
-      <w:r>
-        <w:t xml:space="preserve">🟢 Nice to have</w:t>
-      </w:r>
-    </w:p>
-    <w:p>
-      <w:pPr>
-        <w:shd w:fill="F3F3F3" w:val="clear"/>
-        <w:spacing w:after="0"/>
-      </w:pPr>
-      <w:r>
-        <w:rPr>
-          <w:rFonts w:ascii="Consolas" w:cs="Consolas" w:eastAsia="Consolas" w:hAnsi="Consolas"/>
-          <w:sz w:val="18"/>
-          <w:szCs w:val="18"/>
-        </w:rPr>
-        <w:t xml:space="preserve">| # | Área | Qué pasó |</w:t>
-      </w:r>
-    </w:p>
-    <w:p>
-      <w:pPr>
-        <w:shd w:fill="F3F3F3" w:val="clear"/>
-        <w:spacing w:after="0"/>
-      </w:pPr>
-      <w:r>
-        <w:rPr>
-          <w:rFonts w:ascii="Consolas" w:cs="Consolas" w:eastAsia="Consolas" w:hAnsi="Consolas"/>
-          <w:sz w:val="18"/>
-          <w:szCs w:val="18"/>
-        </w:rPr>
-        <w:t xml:space="preserve">|---|------|----------|</w:t>
-      </w:r>
-    </w:p>
-    <w:p>
-      <w:pPr>
-        <w:shd w:fill="F3F3F3" w:val="clear"/>
-        <w:spacing w:after="0"/>
-      </w:pPr>
-      <w:r>
-        <w:rPr>
-          <w:rFonts w:ascii="Consolas" w:cs="Consolas" w:eastAsia="Consolas" w:hAnsi="Consolas"/>
-          <w:sz w:val="18"/>
-          <w:szCs w:val="18"/>
-        </w:rPr>
-        <w:t xml:space="preserve">| 1 |      |          |</w:t>
+        <w:t xml:space="preserve">11. ❌ Cancelación de citas — `cancel_load` / `confirm_cancellation`</w:t>
+      </w:r>
+    </w:p>
+    <w:p/>
+    <w:p>
+      <w:pPr>
+        <w:spacing w:after="60"/>
+      </w:pPr>
+      <w:r>
+        <w:rPr>
+          <w:b/>
+          <w:bCs/>
+        </w:rPr>
+        <w:t xml:space="preserve">Cómo está construido:</w:t>
+      </w:r>
+    </w:p>
+    <w:p>
+      <w:pPr>
+        <w:pStyle w:val="ListParagraph"/>
+        <w:numPr>
+          <w:ilvl w:val="0"/>
+          <w:numId w:val="1"/>
+        </w:numPr>
+      </w:pPr>
+      <w:r>
+        <w:t xml:space="preserve">Squad de Vapi: el triaje detecta "quiero cancelar" → handoff al asistente de cambios.</w:t>
+      </w:r>
+    </w:p>
+    <w:p>
+      <w:pPr>
+        <w:pStyle w:val="ListParagraph"/>
+        <w:numPr>
+          <w:ilvl w:val="0"/>
+          <w:numId w:val="1"/>
+        </w:numPr>
+      </w:pPr>
+      <w:r>
+        <w:t xml:space="preserve">Tool </w:t>
+      </w:r>
+      <w:r>
+        <w:rPr>
+          <w:rFonts w:ascii="Consolas" w:cs="Consolas" w:eastAsia="Consolas" w:hAnsi="Consolas"/>
+          <w:sz w:val="20"/>
+          <w:szCs w:val="20"/>
+        </w:rPr>
+        <w:t xml:space="preserve">cancel_load</w:t>
+      </w:r>
+      <w:r>
+        <w:t xml:space="preserve">: identifica la carga (por ID-travel / broker) y </w:t>
+      </w:r>
+      <w:r>
+        <w:rPr>
+          <w:b/>
+          <w:bCs/>
+        </w:rPr>
+        <w:t xml:space="preserve">cotiza el TONU</w:t>
+      </w:r>
+    </w:p>
+    <w:p>
+      <w:pPr>
+        <w:spacing w:after="60"/>
+      </w:pPr>
+      <w:r>
+        <w:t xml:space="preserve">  (Truck Ordered Not Used) — la penalización por cancelar, según la tabla </w:t>
+      </w:r>
+      <w:r>
+        <w:rPr>
+          <w:rFonts w:ascii="Consolas" w:cs="Consolas" w:eastAsia="Consolas" w:hAnsi="Consolas"/>
+          <w:sz w:val="20"/>
+          <w:szCs w:val="20"/>
+        </w:rPr>
+        <w:t xml:space="preserve">Config</w:t>
+      </w:r>
+    </w:p>
+    <w:p>
+      <w:pPr>
+        <w:spacing w:after="60"/>
+      </w:pPr>
+      <w:r>
+        <w:t xml:space="preserve">  y qué tan cerca está de la hora de recogida.</w:t>
+      </w:r>
+    </w:p>
+    <w:p>
+      <w:pPr>
+        <w:pStyle w:val="ListParagraph"/>
+        <w:numPr>
+          <w:ilvl w:val="0"/>
+          <w:numId w:val="1"/>
+        </w:numPr>
+      </w:pPr>
+      <w:r>
+        <w:t xml:space="preserve">Tool </w:t>
+      </w:r>
+      <w:r>
+        <w:rPr>
+          <w:rFonts w:ascii="Consolas" w:cs="Consolas" w:eastAsia="Consolas" w:hAnsi="Consolas"/>
+          <w:sz w:val="20"/>
+          <w:szCs w:val="20"/>
+        </w:rPr>
+        <w:t xml:space="preserve">confirm_cancellation</w:t>
+      </w:r>
+      <w:r>
+        <w:t xml:space="preserve">: el broker ACEPTA el TONU → la cita pasa a </w:t>
+      </w:r>
+      <w:r>
+        <w:rPr>
+          <w:rFonts w:ascii="Consolas" w:cs="Consolas" w:eastAsia="Consolas" w:hAnsi="Consolas"/>
+          <w:sz w:val="20"/>
+          <w:szCs w:val="20"/>
+        </w:rPr>
+        <w:t xml:space="preserve">Cancelada</w:t>
+      </w:r>
+    </w:p>
+    <w:p>
+      <w:pPr>
+        <w:spacing w:after="60"/>
+      </w:pPr>
+      <w:r>
+        <w:t xml:space="preserve">  → se </w:t>
+      </w:r>
+      <w:r>
+        <w:rPr>
+          <w:b/>
+          <w:bCs/>
+        </w:rPr>
+        <w:t xml:space="preserve">libera</w:t>
+      </w:r>
+      <w:r>
+        <w:t xml:space="preserve"> el operador/camión (vuelve a estar disponible).</w:t>
+      </w:r>
+    </w:p>
+    <w:p>
+      <w:pPr>
+        <w:pStyle w:val="ListParagraph"/>
+        <w:numPr>
+          <w:ilvl w:val="0"/>
+          <w:numId w:val="1"/>
+        </w:numPr>
+      </w:pPr>
+      <w:r>
+        <w:t xml:space="preserve">El monto del TONU es configurable en </w:t>
+      </w:r>
+      <w:r>
+        <w:rPr>
+          <w:rFonts w:ascii="Consolas" w:cs="Consolas" w:eastAsia="Consolas" w:hAnsi="Consolas"/>
+          <w:sz w:val="20"/>
+          <w:szCs w:val="20"/>
+        </w:rPr>
+        <w:t xml:space="preserve">Config</w:t>
+      </w:r>
+      <w:r>
+        <w:t xml:space="preserve"> (el dueño lo ajusta sin tocar Make).</w:t>
+      </w:r>
+    </w:p>
+    <w:p/>
+    <w:p>
+      <w:pPr>
+        <w:spacing w:after="60"/>
+      </w:pPr>
+      <w:r>
+        <w:rPr>
+          <w:b/>
+          <w:bCs/>
+        </w:rPr>
+        <w:t xml:space="preserve">Tu tarea de análisis (qué entender antes de probar):</w:t>
+      </w:r>
+    </w:p>
+    <w:p>
+      <w:pPr>
+        <w:pStyle w:val="ListParagraph"/>
+        <w:numPr>
+          <w:ilvl w:val="0"/>
+          <w:numId w:val="1"/>
+        </w:numPr>
+      </w:pPr>
+      <w:r>
+        <w:t xml:space="preserve">¿Cómo identifica CUÁL carga cancelar? (número de carga / broker)</w:t>
+      </w:r>
+    </w:p>
+    <w:p>
+      <w:pPr>
+        <w:pStyle w:val="ListParagraph"/>
+        <w:numPr>
+          <w:ilvl w:val="0"/>
+          <w:numId w:val="1"/>
+        </w:numPr>
+      </w:pPr>
+      <w:r>
+        <w:t xml:space="preserve">¿Cómo calcula el TONU? (¿fijo? ¿sube si está cerca de la hora?) → míralo en </w:t>
+      </w:r>
+      <w:r>
+        <w:rPr>
+          <w:rFonts w:ascii="Consolas" w:cs="Consolas" w:eastAsia="Consolas" w:hAnsi="Consolas"/>
+          <w:sz w:val="20"/>
+          <w:szCs w:val="20"/>
+        </w:rPr>
+        <w:t xml:space="preserve">Config</w:t>
+      </w:r>
+    </w:p>
+    <w:p>
+      <w:pPr>
+        <w:pStyle w:val="ListParagraph"/>
+        <w:numPr>
+          <w:ilvl w:val="0"/>
+          <w:numId w:val="1"/>
+        </w:numPr>
+      </w:pPr>
+      <w:r>
+        <w:t xml:space="preserve">Al confirmar: ¿solo cambia el estado, o también libera el camión y avisa a alguien?</w:t>
+      </w:r>
+    </w:p>
+    <w:p/>
+    <w:p>
+      <w:pPr>
+        <w:spacing w:after="60"/>
+      </w:pPr>
+      <w:r>
+        <w:rPr>
+          <w:b/>
+          <w:bCs/>
+        </w:rPr>
+        <w:t xml:space="preserve">Probar:</w:t>
+      </w:r>
+    </w:p>
+    <w:p>
+      <w:pPr>
+        <w:pStyle w:val="ListParagraph"/>
+        <w:numPr>
+          <w:ilvl w:val="0"/>
+          <w:numId w:val="1"/>
+        </w:numPr>
+      </w:pPr>
+      <w:r>
+        <w:t xml:space="preserve">[ ] Broker llama a cancelar → la IA identifica la carga correcta</w:t>
+      </w:r>
+    </w:p>
+    <w:p>
+      <w:pPr>
+        <w:pStyle w:val="ListParagraph"/>
+        <w:numPr>
+          <w:ilvl w:val="0"/>
+          <w:numId w:val="1"/>
+        </w:numPr>
+      </w:pPr>
+      <w:r>
+        <w:t xml:space="preserve">[ ] Cotiza el TONU correcto (según Config / cercanía a la hora)</w:t>
+      </w:r>
+    </w:p>
+    <w:p>
+      <w:pPr>
+        <w:pStyle w:val="ListParagraph"/>
+        <w:numPr>
+          <w:ilvl w:val="0"/>
+          <w:numId w:val="1"/>
+        </w:numPr>
+      </w:pPr>
+      <w:r>
+        <w:t xml:space="preserve">[ ] Confirmar → la cita queda </w:t>
+      </w:r>
+      <w:r>
+        <w:rPr>
+          <w:rFonts w:ascii="Consolas" w:cs="Consolas" w:eastAsia="Consolas" w:hAnsi="Consolas"/>
+          <w:sz w:val="20"/>
+          <w:szCs w:val="20"/>
+        </w:rPr>
+        <w:t xml:space="preserve">Cancelada</w:t>
+      </w:r>
+    </w:p>
+    <w:p>
+      <w:pPr>
+        <w:pStyle w:val="ListParagraph"/>
+        <w:numPr>
+          <w:ilvl w:val="0"/>
+          <w:numId w:val="1"/>
+        </w:numPr>
+      </w:pPr>
+      <w:r>
+        <w:t xml:space="preserve">[ ] El operador/camión se LIBERA (ya disponible para otra carga)</w:t>
+      </w:r>
+    </w:p>
+    <w:p>
+      <w:pPr>
+        <w:pStyle w:val="ListParagraph"/>
+        <w:numPr>
+          <w:ilvl w:val="0"/>
+          <w:numId w:val="1"/>
+        </w:numPr>
+      </w:pPr>
+      <w:r>
+        <w:t xml:space="preserve">[ ] El detector de conflictos ya NO cuenta esa cita (canceladas no chocan)</w:t>
+      </w:r>
+    </w:p>
+    <w:p>
+      <w:pPr>
+        <w:pStyle w:val="ListParagraph"/>
+        <w:numPr>
+          <w:ilvl w:val="0"/>
+          <w:numId w:val="1"/>
+        </w:numPr>
+      </w:pPr>
+      <w:r>
+        <w:t xml:space="preserve">[ ] (si aplica) se registra el cargo del TONU para cobrarlo</w:t>
+      </w:r>
+    </w:p>
+    <w:p/>
+    <w:p>
+      <w:pPr>
+        <w:spacing w:after="60"/>
+      </w:pPr>
+      <w:r>
+        <w:rPr>
+          <w:b/>
+          <w:bCs/>
+        </w:rPr>
+        <w:t xml:space="preserve">Estado:</w:t>
+      </w:r>
+      <w:r>
+        <w:t xml:space="preserve"> [ ] Revisado</w:t>
+      </w:r>
+    </w:p>
+    <w:p>
+      <w:pPr>
+        <w:spacing w:after="60"/>
+      </w:pPr>
+      <w:r>
+        <w:rPr>
+          <w:b/>
+          <w:bCs/>
+        </w:rPr>
+        <w:t xml:space="preserve">Notas:</w:t>
+      </w:r>
+    </w:p>
+    <w:p>
+      <w:pPr>
+        <w:shd w:fill="F3F3F3" w:val="clear"/>
+        <w:spacing w:after="0"/>
+      </w:pPr>
+      <w:r>
+        <w:rPr>
+          <w:rFonts w:ascii="Consolas" w:cs="Consolas" w:eastAsia="Consolas" w:hAnsi="Consolas"/>
+          <w:sz w:val="18"/>
+          <w:szCs w:val="18"/>
+        </w:rPr>
+        <w:t xml:space="preserve">(severidad · qué pasó)</w:t>
+      </w:r>
+    </w:p>
+    <w:p>
+      <w:pPr>
+        <w:shd w:fill="F3F3F3" w:val="clear"/>
+        <w:spacing w:after="0"/>
+      </w:pPr>
+      <w:r>
+        <w:rPr>
+          <w:rFonts w:ascii="Consolas" w:cs="Consolas" w:eastAsia="Consolas" w:hAnsi="Consolas"/>
+          <w:sz w:val="18"/>
+          <w:szCs w:val="18"/>
+        </w:rPr>
+        <w:t xml:space="preserve"> </w:t>
       </w:r>
     </w:p>
     <w:p/>
@@ -2945,105 +3137,402 @@
         <w:spacing w:after="100" w:before="220"/>
       </w:pPr>
       <w:r>
-        <w:t xml:space="preserve">✅ Definición de "listo para el demo"</w:t>
-      </w:r>
-    </w:p>
-    <w:p/>
-    <w:p>
-      <w:pPr>
-        <w:shd w:fill="F3F3F3" w:val="clear"/>
-        <w:spacing w:after="0"/>
-      </w:pPr>
-      <w:r>
-        <w:rPr>
-          <w:rFonts w:ascii="Consolas" w:cs="Consolas" w:eastAsia="Consolas" w:hAnsi="Consolas"/>
-          <w:sz w:val="18"/>
-          <w:szCs w:val="18"/>
-        </w:rPr>
-        <w:t xml:space="preserve">[ ] Todos los 🔴 arreglados</w:t>
-      </w:r>
-    </w:p>
-    <w:p>
-      <w:pPr>
-        <w:shd w:fill="F3F3F3" w:val="clear"/>
-        <w:spacing w:after="0"/>
-      </w:pPr>
-      <w:r>
-        <w:rPr>
-          <w:rFonts w:ascii="Consolas" w:cs="Consolas" w:eastAsia="Consolas" w:hAnsi="Consolas"/>
-          <w:sz w:val="18"/>
-          <w:szCs w:val="18"/>
-        </w:rPr>
-        <w:t xml:space="preserve">[ ] Los flujos principales corren de punta a punta sin caerse:</w:t>
-      </w:r>
-    </w:p>
-    <w:p>
-      <w:pPr>
-        <w:shd w:fill="F3F3F3" w:val="clear"/>
-        <w:spacing w:after="0"/>
-      </w:pPr>
-      <w:r>
-        <w:rPr>
-          <w:rFonts w:ascii="Consolas" w:cs="Consolas" w:eastAsia="Consolas" w:hAnsi="Consolas"/>
-          <w:sz w:val="18"/>
-          <w:szCs w:val="18"/>
-        </w:rPr>
-        <w:t xml:space="preserve">      cotizar por voz → confirmar → despachar → En_Route → entregar → facturar</w:t>
-      </w:r>
-    </w:p>
-    <w:p>
-      <w:pPr>
-        <w:shd w:fill="F3F3F3" w:val="clear"/>
-        <w:spacing w:after="0"/>
-      </w:pPr>
-      <w:r>
-        <w:rPr>
-          <w:rFonts w:ascii="Consolas" w:cs="Consolas" w:eastAsia="Consolas" w:hAnsi="Consolas"/>
-          <w:sz w:val="18"/>
-          <w:szCs w:val="18"/>
-        </w:rPr>
-        <w:t xml:space="preserve">[ ] Las interfaces del dueño se ven limpias y profesionales (y en celular)</w:t>
-      </w:r>
-    </w:p>
-    <w:p>
-      <w:pPr>
-        <w:shd w:fill="F3F3F3" w:val="clear"/>
-        <w:spacing w:after="0"/>
-      </w:pPr>
-      <w:r>
-        <w:rPr>
-          <w:rFonts w:ascii="Consolas" w:cs="Consolas" w:eastAsia="Consolas" w:hAnsi="Consolas"/>
-          <w:sz w:val="18"/>
-          <w:szCs w:val="18"/>
-        </w:rPr>
-        <w:t xml:space="preserve">[ ] La demo se puede MOSTRAR sin vergüenza (los 🟡/🟢 pueden esperar)</w:t>
-      </w:r>
-    </w:p>
-    <w:p/>
-    <w:p>
-      <w:pPr>
-        <w:spacing w:after="60"/>
-      </w:pPr>
-      <w:r>
-        <w:t xml:space="preserve">Cuando esto se cumpla → </w:t>
-      </w:r>
-      <w:r>
-        <w:rPr>
-          <w:b/>
-          <w:bCs/>
-        </w:rPr>
-        <w:t xml:space="preserve">sales al demo.</w:t>
-      </w:r>
-      <w:r>
-        <w:t xml:space="preserve"> Los detalles restantes se pulen con</w:t>
-      </w:r>
-    </w:p>
-    <w:p>
-      <w:pPr>
-        <w:spacing w:after="60"/>
-      </w:pPr>
-      <w:r>
-        <w:t xml:space="preserve">feedback real y dinero entrando.</w:t>
+        <w:t xml:space="preserve">12. 🔄 Reprogramación de citas — `reschedule_load` / `confirm_reschedule`</w:t>
+      </w:r>
+    </w:p>
+    <w:p/>
+    <w:p>
+      <w:pPr>
+        <w:spacing w:after="60"/>
+      </w:pPr>
+      <w:r>
+        <w:rPr>
+          <w:b/>
+          <w:bCs/>
+        </w:rPr>
+        <w:t xml:space="preserve">Cómo está construido:</w:t>
+      </w:r>
+    </w:p>
+    <w:p>
+      <w:pPr>
+        <w:pStyle w:val="ListParagraph"/>
+        <w:numPr>
+          <w:ilvl w:val="0"/>
+          <w:numId w:val="1"/>
+        </w:numPr>
+      </w:pPr>
+      <w:r>
+        <w:t xml:space="preserve">Squad de Vapi: triaje detecta "quiero cambiar la hora/fecha" → handoff a cambios.</w:t>
+      </w:r>
+    </w:p>
+    <w:p>
+      <w:pPr>
+        <w:pStyle w:val="ListParagraph"/>
+        <w:numPr>
+          <w:ilvl w:val="0"/>
+          <w:numId w:val="1"/>
+        </w:numPr>
+      </w:pPr>
+      <w:r>
+        <w:t xml:space="preserve">Tool </w:t>
+      </w:r>
+      <w:r>
+        <w:rPr>
+          <w:rFonts w:ascii="Consolas" w:cs="Consolas" w:eastAsia="Consolas" w:hAnsi="Consolas"/>
+          <w:sz w:val="20"/>
+          <w:szCs w:val="20"/>
+        </w:rPr>
+        <w:t xml:space="preserve">reschedule_load</w:t>
+      </w:r>
+      <w:r>
+        <w:t xml:space="preserve">: identifica la carga y </w:t>
+      </w:r>
+      <w:r>
+        <w:rPr>
+          <w:b/>
+          <w:bCs/>
+        </w:rPr>
+        <w:t xml:space="preserve">cotiza Detention/Layover</w:t>
+      </w:r>
+      <w:r>
+        <w:t xml:space="preserve"> si aplica.</w:t>
+      </w:r>
+    </w:p>
+    <w:p>
+      <w:pPr>
+        <w:pStyle w:val="ListParagraph"/>
+        <w:numPr>
+          <w:ilvl w:val="0"/>
+          <w:numId w:val="1"/>
+        </w:numPr>
+      </w:pPr>
+      <w:r>
+        <w:rPr>
+          <w:b/>
+          <w:bCs/>
+        </w:rPr>
+        <w:t xml:space="preserve">Escalera de reasignación de 3 niveles</w:t>
+      </w:r>
+      <w:r>
+        <w:t xml:space="preserve"> (intenta en orden):</w:t>
+      </w:r>
+    </w:p>
+    <w:p>
+      <w:pPr>
+        <w:spacing w:after="60"/>
+      </w:pPr>
+      <w:r>
+        <w:t xml:space="preserve">  1. </w:t>
+      </w:r>
+      <w:r>
+        <w:rPr>
+          <w:b/>
+          <w:bCs/>
+        </w:rPr>
+        <w:t xml:space="preserve">Mismo camión</w:t>
+      </w:r>
+      <w:r>
+        <w:t xml:space="preserve"> a la nueva hora (si le cabe en su turno/HOS)</w:t>
+      </w:r>
+    </w:p>
+    <w:p>
+      <w:pPr>
+        <w:spacing w:after="60"/>
+      </w:pPr>
+      <w:r>
+        <w:t xml:space="preserve">  2. </w:t>
+      </w:r>
+      <w:r>
+        <w:rPr>
+          <w:b/>
+          <w:bCs/>
+        </w:rPr>
+        <w:t xml:space="preserve">Otro camión</w:t>
+      </w:r>
+      <w:r>
+        <w:t xml:space="preserve"> (si el primero no puede)</w:t>
+      </w:r>
+    </w:p>
+    <w:p>
+      <w:pPr>
+        <w:spacing w:after="60"/>
+      </w:pPr>
+      <w:r>
+        <w:t xml:space="preserve">  3. </w:t>
+      </w:r>
+      <w:r>
+        <w:rPr>
+          <w:b/>
+          <w:bCs/>
+        </w:rPr>
+        <w:t xml:space="preserve">Hora alternativa</w:t>
+      </w:r>
+      <w:r>
+        <w:t xml:space="preserve"> (si ningún camión cabe a la hora pedida)</w:t>
+      </w:r>
+    </w:p>
+    <w:p>
+      <w:pPr>
+        <w:pStyle w:val="ListParagraph"/>
+        <w:numPr>
+          <w:ilvl w:val="0"/>
+          <w:numId w:val="1"/>
+        </w:numPr>
+      </w:pPr>
+      <w:r>
+        <w:t xml:space="preserve">Tool </w:t>
+      </w:r>
+      <w:r>
+        <w:rPr>
+          <w:rFonts w:ascii="Consolas" w:cs="Consolas" w:eastAsia="Consolas" w:hAnsi="Consolas"/>
+          <w:sz w:val="20"/>
+          <w:szCs w:val="20"/>
+        </w:rPr>
+        <w:t xml:space="preserve">confirm_reschedule</w:t>
+      </w:r>
+      <w:r>
+        <w:t xml:space="preserve">: aplica el cambio (nueva hora y/o camión) + los fees.</w:t>
+      </w:r>
+    </w:p>
+    <w:p>
+      <w:pPr>
+        <w:pStyle w:val="ListParagraph"/>
+        <w:numPr>
+          <w:ilvl w:val="0"/>
+          <w:numId w:val="1"/>
+        </w:numPr>
+      </w:pPr>
+      <w:r>
+        <w:t xml:space="preserve">Detention/Layover configurables en </w:t>
+      </w:r>
+      <w:r>
+        <w:rPr>
+          <w:rFonts w:ascii="Consolas" w:cs="Consolas" w:eastAsia="Consolas" w:hAnsi="Consolas"/>
+          <w:sz w:val="20"/>
+          <w:szCs w:val="20"/>
+        </w:rPr>
+        <w:t xml:space="preserve">Config</w:t>
+      </w:r>
+      <w:r>
+        <w:t xml:space="preserve">.</w:t>
+      </w:r>
+    </w:p>
+    <w:p/>
+    <w:p>
+      <w:pPr>
+        <w:spacing w:after="60"/>
+      </w:pPr>
+      <w:r>
+        <w:rPr>
+          <w:b/>
+          <w:bCs/>
+        </w:rPr>
+        <w:t xml:space="preserve">Tu tarea de análisis (qué entender antes de probar):</w:t>
+      </w:r>
+    </w:p>
+    <w:p>
+      <w:pPr>
+        <w:pStyle w:val="ListParagraph"/>
+        <w:numPr>
+          <w:ilvl w:val="0"/>
+          <w:numId w:val="1"/>
+        </w:numPr>
+      </w:pPr>
+      <w:r>
+        <w:t xml:space="preserve">La </w:t>
+      </w:r>
+      <w:r>
+        <w:rPr>
+          <w:b/>
+          <w:bCs/>
+        </w:rPr>
+        <w:t xml:space="preserve">escalera de 3 niveles</w:t>
+      </w:r>
+      <w:r>
+        <w:t xml:space="preserve">: ¿en qué orden intenta y cuándo salta al siguiente?</w:t>
+      </w:r>
+    </w:p>
+    <w:p>
+      <w:pPr>
+        <w:pStyle w:val="ListParagraph"/>
+        <w:numPr>
+          <w:ilvl w:val="0"/>
+          <w:numId w:val="1"/>
+        </w:numPr>
+      </w:pPr>
+      <w:r>
+        <w:t xml:space="preserve">¿Cómo calcula Detention (espera) vs Layover (pernocta)? → míralo en </w:t>
+      </w:r>
+      <w:r>
+        <w:rPr>
+          <w:rFonts w:ascii="Consolas" w:cs="Consolas" w:eastAsia="Consolas" w:hAnsi="Consolas"/>
+          <w:sz w:val="20"/>
+          <w:szCs w:val="20"/>
+        </w:rPr>
+        <w:t xml:space="preserve">Config</w:t>
+      </w:r>
+    </w:p>
+    <w:p>
+      <w:pPr>
+        <w:pStyle w:val="ListParagraph"/>
+        <w:numPr>
+          <w:ilvl w:val="0"/>
+          <w:numId w:val="1"/>
+        </w:numPr>
+      </w:pPr>
+      <w:r>
+        <w:t xml:space="preserve">Si reasigna a OTRO camión: ¿el camión viejo se LIBERA? ¿el turno se reajusta?</w:t>
+      </w:r>
+    </w:p>
+    <w:p/>
+    <w:p>
+      <w:pPr>
+        <w:spacing w:after="60"/>
+      </w:pPr>
+      <w:r>
+        <w:rPr>
+          <w:b/>
+          <w:bCs/>
+        </w:rPr>
+        <w:t xml:space="preserve">Probar:</w:t>
+      </w:r>
+    </w:p>
+    <w:p>
+      <w:pPr>
+        <w:pStyle w:val="ListParagraph"/>
+        <w:numPr>
+          <w:ilvl w:val="0"/>
+          <w:numId w:val="1"/>
+        </w:numPr>
+      </w:pPr>
+      <w:r>
+        <w:t xml:space="preserve">[ ] Broker pide cambiar la hora → la IA identifica la carga</w:t>
+      </w:r>
+    </w:p>
+    <w:p>
+      <w:pPr>
+        <w:pStyle w:val="ListParagraph"/>
+        <w:numPr>
+          <w:ilvl w:val="0"/>
+          <w:numId w:val="1"/>
+        </w:numPr>
+      </w:pPr>
+      <w:r>
+        <w:t xml:space="preserve">[ ] Nivel 1: intenta el MISMO camión a la nueva hora (si cabe)</w:t>
+      </w:r>
+    </w:p>
+    <w:p>
+      <w:pPr>
+        <w:pStyle w:val="ListParagraph"/>
+        <w:numPr>
+          <w:ilvl w:val="0"/>
+          <w:numId w:val="1"/>
+        </w:numPr>
+      </w:pPr>
+      <w:r>
+        <w:t xml:space="preserve">[ ] Nivel 2: si no cabe → ofrece OTRO camión</w:t>
+      </w:r>
+    </w:p>
+    <w:p>
+      <w:pPr>
+        <w:pStyle w:val="ListParagraph"/>
+        <w:numPr>
+          <w:ilvl w:val="0"/>
+          <w:numId w:val="1"/>
+        </w:numPr>
+      </w:pPr>
+      <w:r>
+        <w:t xml:space="preserve">[ ] Nivel 3: si ninguno → ofrece una HORA ALTERNATIVA</w:t>
+      </w:r>
+    </w:p>
+    <w:p>
+      <w:pPr>
+        <w:pStyle w:val="ListParagraph"/>
+        <w:numPr>
+          <w:ilvl w:val="0"/>
+          <w:numId w:val="1"/>
+        </w:numPr>
+      </w:pPr>
+      <w:r>
+        <w:t xml:space="preserve">[ ] Cotiza Detention/Layover cuando aplica</w:t>
+      </w:r>
+    </w:p>
+    <w:p>
+      <w:pPr>
+        <w:pStyle w:val="ListParagraph"/>
+        <w:numPr>
+          <w:ilvl w:val="0"/>
+          <w:numId w:val="1"/>
+        </w:numPr>
+      </w:pPr>
+      <w:r>
+        <w:t xml:space="preserve">[ ] Confirmar → la cita se actualiza (hora/camión) sin romper HOS ni turnos</w:t>
+      </w:r>
+    </w:p>
+    <w:p>
+      <w:pPr>
+        <w:pStyle w:val="ListParagraph"/>
+        <w:numPr>
+          <w:ilvl w:val="0"/>
+          <w:numId w:val="1"/>
+        </w:numPr>
+      </w:pPr>
+      <w:r>
+        <w:t xml:space="preserve">[ ] El camión viejo se libera si hubo cambio de camión</w:t>
+      </w:r>
+    </w:p>
+    <w:p>
+      <w:pPr>
+        <w:pStyle w:val="ListParagraph"/>
+        <w:numPr>
+          <w:ilvl w:val="0"/>
+          <w:numId w:val="1"/>
+        </w:numPr>
+      </w:pPr>
+      <w:r>
+        <w:t xml:space="preserve">[ ] El detector de conflictos no marca falso choque tras el cambio</w:t>
+      </w:r>
+    </w:p>
+    <w:p/>
+    <w:p>
+      <w:pPr>
+        <w:spacing w:after="60"/>
+      </w:pPr>
+      <w:r>
+        <w:rPr>
+          <w:b/>
+          <w:bCs/>
+        </w:rPr>
+        <w:t xml:space="preserve">Estado:</w:t>
+      </w:r>
+      <w:r>
+        <w:t xml:space="preserve"> [ ] Revisado</w:t>
+      </w:r>
+    </w:p>
+    <w:p>
+      <w:pPr>
+        <w:spacing w:after="60"/>
+      </w:pPr>
+      <w:r>
+        <w:rPr>
+          <w:b/>
+          <w:bCs/>
+        </w:rPr>
+        <w:t xml:space="preserve">Notas:</w:t>
+      </w:r>
+    </w:p>
+    <w:p>
+      <w:pPr>
+        <w:shd w:fill="F3F3F3" w:val="clear"/>
+        <w:spacing w:after="0"/>
+      </w:pPr>
+      <w:r>
+        <w:rPr>
+          <w:rFonts w:ascii="Consolas" w:cs="Consolas" w:eastAsia="Consolas" w:hAnsi="Consolas"/>
+          <w:sz w:val="18"/>
+          <w:szCs w:val="18"/>
+        </w:rPr>
+        <w:t xml:space="preserve"> </w:t>
       </w:r>
     </w:p>
     <w:p/>
@@ -3062,7 +3551,336 @@
         <w:spacing w:after="100" w:before="220"/>
       </w:pPr>
       <w:r>
+        <w:t xml:space="preserve">📋 Tracker consolidado (llénalo al final)</w:t>
+      </w:r>
+    </w:p>
+    <w:p/>
+    <w:p>
+      <w:pPr>
+        <w:spacing w:after="60"/>
+      </w:pPr>
+      <w:r>
+        <w:t xml:space="preserve">Después de revisar todo, junta aquí lo anotado, ordenado por severidad:</w:t>
+      </w:r>
+    </w:p>
+    <w:p/>
+    <w:p>
+      <w:pPr>
+        <w:pStyle w:val="Heading3"/>
+        <w:spacing w:after="80" w:before="180"/>
+      </w:pPr>
+      <w:r>
+        <w:t xml:space="preserve">🔴 Bloquea demo (arreglar ANTES de salir)</w:t>
+      </w:r>
+    </w:p>
+    <w:p>
+      <w:pPr>
+        <w:shd w:fill="F3F3F3" w:val="clear"/>
+        <w:spacing w:after="0"/>
+      </w:pPr>
+      <w:r>
+        <w:rPr>
+          <w:rFonts w:ascii="Consolas" w:cs="Consolas" w:eastAsia="Consolas" w:hAnsi="Consolas"/>
+          <w:sz w:val="18"/>
+          <w:szCs w:val="18"/>
+        </w:rPr>
+        <w:t xml:space="preserve">| # | Área | Qué pasó | Estado |</w:t>
+      </w:r>
+    </w:p>
+    <w:p>
+      <w:pPr>
+        <w:shd w:fill="F3F3F3" w:val="clear"/>
+        <w:spacing w:after="0"/>
+      </w:pPr>
+      <w:r>
+        <w:rPr>
+          <w:rFonts w:ascii="Consolas" w:cs="Consolas" w:eastAsia="Consolas" w:hAnsi="Consolas"/>
+          <w:sz w:val="18"/>
+          <w:szCs w:val="18"/>
+        </w:rPr>
+        <w:t xml:space="preserve">|---|------|----------|--------|</w:t>
+      </w:r>
+    </w:p>
+    <w:p>
+      <w:pPr>
+        <w:shd w:fill="F3F3F3" w:val="clear"/>
+        <w:spacing w:after="0"/>
+      </w:pPr>
+      <w:r>
+        <w:rPr>
+          <w:rFonts w:ascii="Consolas" w:cs="Consolas" w:eastAsia="Consolas" w:hAnsi="Consolas"/>
+          <w:sz w:val="18"/>
+          <w:szCs w:val="18"/>
+        </w:rPr>
+        <w:t xml:space="preserve">| 1 |      |          |        |</w:t>
+      </w:r>
+    </w:p>
+    <w:p/>
+    <w:p>
+      <w:pPr>
+        <w:pStyle w:val="Heading3"/>
+        <w:spacing w:after="80" w:before="180"/>
+      </w:pPr>
+      <w:r>
+        <w:t xml:space="preserve">🟡 Después (post-demo)</w:t>
+      </w:r>
+    </w:p>
+    <w:p>
+      <w:pPr>
+        <w:shd w:fill="F3F3F3" w:val="clear"/>
+        <w:spacing w:after="0"/>
+      </w:pPr>
+      <w:r>
+        <w:rPr>
+          <w:rFonts w:ascii="Consolas" w:cs="Consolas" w:eastAsia="Consolas" w:hAnsi="Consolas"/>
+          <w:sz w:val="18"/>
+          <w:szCs w:val="18"/>
+        </w:rPr>
+        <w:t xml:space="preserve">| # | Área | Qué pasó |</w:t>
+      </w:r>
+    </w:p>
+    <w:p>
+      <w:pPr>
+        <w:shd w:fill="F3F3F3" w:val="clear"/>
+        <w:spacing w:after="0"/>
+      </w:pPr>
+      <w:r>
+        <w:rPr>
+          <w:rFonts w:ascii="Consolas" w:cs="Consolas" w:eastAsia="Consolas" w:hAnsi="Consolas"/>
+          <w:sz w:val="18"/>
+          <w:szCs w:val="18"/>
+        </w:rPr>
+        <w:t xml:space="preserve">|---|------|----------|</w:t>
+      </w:r>
+    </w:p>
+    <w:p>
+      <w:pPr>
+        <w:shd w:fill="F3F3F3" w:val="clear"/>
+        <w:spacing w:after="0"/>
+      </w:pPr>
+      <w:r>
+        <w:rPr>
+          <w:rFonts w:ascii="Consolas" w:cs="Consolas" w:eastAsia="Consolas" w:hAnsi="Consolas"/>
+          <w:sz w:val="18"/>
+          <w:szCs w:val="18"/>
+        </w:rPr>
+        <w:t xml:space="preserve">| 1 |      |          |</w:t>
+      </w:r>
+    </w:p>
+    <w:p/>
+    <w:p>
+      <w:pPr>
+        <w:pStyle w:val="Heading3"/>
+        <w:spacing w:after="80" w:before="180"/>
+      </w:pPr>
+      <w:r>
+        <w:t xml:space="preserve">🟢 Nice to have</w:t>
+      </w:r>
+    </w:p>
+    <w:p>
+      <w:pPr>
+        <w:shd w:fill="F3F3F3" w:val="clear"/>
+        <w:spacing w:after="0"/>
+      </w:pPr>
+      <w:r>
+        <w:rPr>
+          <w:rFonts w:ascii="Consolas" w:cs="Consolas" w:eastAsia="Consolas" w:hAnsi="Consolas"/>
+          <w:sz w:val="18"/>
+          <w:szCs w:val="18"/>
+        </w:rPr>
+        <w:t xml:space="preserve">| # | Área | Qué pasó |</w:t>
+      </w:r>
+    </w:p>
+    <w:p>
+      <w:pPr>
+        <w:shd w:fill="F3F3F3" w:val="clear"/>
+        <w:spacing w:after="0"/>
+      </w:pPr>
+      <w:r>
+        <w:rPr>
+          <w:rFonts w:ascii="Consolas" w:cs="Consolas" w:eastAsia="Consolas" w:hAnsi="Consolas"/>
+          <w:sz w:val="18"/>
+          <w:szCs w:val="18"/>
+        </w:rPr>
+        <w:t xml:space="preserve">|---|------|----------|</w:t>
+      </w:r>
+    </w:p>
+    <w:p>
+      <w:pPr>
+        <w:shd w:fill="F3F3F3" w:val="clear"/>
+        <w:spacing w:after="0"/>
+      </w:pPr>
+      <w:r>
+        <w:rPr>
+          <w:rFonts w:ascii="Consolas" w:cs="Consolas" w:eastAsia="Consolas" w:hAnsi="Consolas"/>
+          <w:sz w:val="18"/>
+          <w:szCs w:val="18"/>
+        </w:rPr>
+        <w:t xml:space="preserve">| 1 |      |          |</w:t>
+      </w:r>
+    </w:p>
+    <w:p/>
+    <w:p>
+      <w:pPr>
+        <w:pBdr>
+          <w:bottom w:val="single" w:color="BBBBBB" w:sz="6"/>
+        </w:pBdr>
+        <w:spacing w:after="80" w:before="80"/>
+      </w:pPr>
+    </w:p>
+    <w:p/>
+    <w:p>
+      <w:pPr>
+        <w:pStyle w:val="Heading2"/>
+        <w:spacing w:after="100" w:before="220"/>
+      </w:pPr>
+      <w:r>
+        <w:t xml:space="preserve">✅ Definición de "listo para el demo"</w:t>
+      </w:r>
+    </w:p>
+    <w:p/>
+    <w:p>
+      <w:pPr>
+        <w:shd w:fill="F3F3F3" w:val="clear"/>
+        <w:spacing w:after="0"/>
+      </w:pPr>
+      <w:r>
+        <w:rPr>
+          <w:rFonts w:ascii="Consolas" w:cs="Consolas" w:eastAsia="Consolas" w:hAnsi="Consolas"/>
+          <w:sz w:val="18"/>
+          <w:szCs w:val="18"/>
+        </w:rPr>
+        <w:t xml:space="preserve">[ ] Todos los 🔴 arreglados</w:t>
+      </w:r>
+    </w:p>
+    <w:p>
+      <w:pPr>
+        <w:shd w:fill="F3F3F3" w:val="clear"/>
+        <w:spacing w:after="0"/>
+      </w:pPr>
+      <w:r>
+        <w:rPr>
+          <w:rFonts w:ascii="Consolas" w:cs="Consolas" w:eastAsia="Consolas" w:hAnsi="Consolas"/>
+          <w:sz w:val="18"/>
+          <w:szCs w:val="18"/>
+        </w:rPr>
+        <w:t xml:space="preserve">[ ] Los flujos principales corren de punta a punta sin caerse:</w:t>
+      </w:r>
+    </w:p>
+    <w:p>
+      <w:pPr>
+        <w:shd w:fill="F3F3F3" w:val="clear"/>
+        <w:spacing w:after="0"/>
+      </w:pPr>
+      <w:r>
+        <w:rPr>
+          <w:rFonts w:ascii="Consolas" w:cs="Consolas" w:eastAsia="Consolas" w:hAnsi="Consolas"/>
+          <w:sz w:val="18"/>
+          <w:szCs w:val="18"/>
+        </w:rPr>
+        <w:t xml:space="preserve">      cotizar por voz → confirmar → despachar → En_Route → entregar → facturar</w:t>
+      </w:r>
+    </w:p>
+    <w:p>
+      <w:pPr>
+        <w:shd w:fill="F3F3F3" w:val="clear"/>
+        <w:spacing w:after="0"/>
+      </w:pPr>
+      <w:r>
+        <w:rPr>
+          <w:rFonts w:ascii="Consolas" w:cs="Consolas" w:eastAsia="Consolas" w:hAnsi="Consolas"/>
+          <w:sz w:val="18"/>
+          <w:szCs w:val="18"/>
+        </w:rPr>
+        <w:t xml:space="preserve">[ ] Las interfaces del dueño se ven limpias y profesionales (y en celular)</w:t>
+      </w:r>
+    </w:p>
+    <w:p>
+      <w:pPr>
+        <w:shd w:fill="F3F3F3" w:val="clear"/>
+        <w:spacing w:after="0"/>
+      </w:pPr>
+      <w:r>
+        <w:rPr>
+          <w:rFonts w:ascii="Consolas" w:cs="Consolas" w:eastAsia="Consolas" w:hAnsi="Consolas"/>
+          <w:sz w:val="18"/>
+          <w:szCs w:val="18"/>
+        </w:rPr>
+        <w:t xml:space="preserve">[ ] La demo se puede MOSTRAR sin vergüenza (los 🟡/🟢 pueden esperar)</w:t>
+      </w:r>
+    </w:p>
+    <w:p/>
+    <w:p>
+      <w:pPr>
+        <w:spacing w:after="60"/>
+      </w:pPr>
+      <w:r>
+        <w:t xml:space="preserve">Cuando esto se cumpla → </w:t>
+      </w:r>
+      <w:r>
+        <w:rPr>
+          <w:b/>
+          <w:bCs/>
+        </w:rPr>
+        <w:t xml:space="preserve">sales al demo.</w:t>
+      </w:r>
+      <w:r>
+        <w:t xml:space="preserve"> Los detalles restantes se pulen con</w:t>
+      </w:r>
+    </w:p>
+    <w:p>
+      <w:pPr>
+        <w:spacing w:after="60"/>
+      </w:pPr>
+      <w:r>
+        <w:t xml:space="preserve">feedback real y dinero entrando.</w:t>
+      </w:r>
+    </w:p>
+    <w:p/>
+    <w:p>
+      <w:pPr>
+        <w:pBdr>
+          <w:bottom w:val="single" w:color="BBBBBB" w:sz="6"/>
+        </w:pBdr>
+        <w:spacing w:after="80" w:before="80"/>
+      </w:pPr>
+    </w:p>
+    <w:p/>
+    <w:p>
+      <w:pPr>
+        <w:pStyle w:val="Heading2"/>
+        <w:spacing w:after="100" w:before="220"/>
+      </w:pPr>
+      <w:r>
         <w:t xml:space="preserve">Cambios</w:t>
+      </w:r>
+    </w:p>
+    <w:p>
+      <w:pPr>
+        <w:pStyle w:val="ListParagraph"/>
+        <w:numPr>
+          <w:ilvl w:val="0"/>
+          <w:numId w:val="1"/>
+        </w:numPr>
+      </w:pPr>
+      <w:r>
+        <w:t xml:space="preserve">2026-09-11 — agregadas 2 tareas de análisis: cancelación (cancel_load /</w:t>
+      </w:r>
+    </w:p>
+    <w:p>
+      <w:pPr>
+        <w:spacing w:after="60"/>
+      </w:pPr>
+      <w:r>
+        <w:t xml:space="preserve">  confirm_cancellation, TONU) y reprogramación (reschedule_load /</w:t>
+      </w:r>
+    </w:p>
+    <w:p>
+      <w:pPr>
+        <w:spacing w:after="60"/>
+      </w:pPr>
+      <w:r>
+        <w:t xml:space="preserve">  confirm_reschedule, escalera de 3 niveles, Detention/Layover).</w:t>
       </w:r>
     </w:p>
     <w:p>

</xml_diff>